<commit_message>
Prevent callout boxes from breaking across pages in reference doc
</commit_message>
<xml_diff>
--- a/training/research-cycle-handbook/custom-reference-doc.docx
+++ b/training/research-cycle-handbook/custom-reference-doc.docx
@@ -213,7 +213,6 @@
         <w:tblStyle w:val="Table"/>
         <w:tblW w:w="0" w:type="auto"/>
         <w:tblLook w:val="07E0" w:firstRow="1" w:lastRow="1" w:firstColumn="1" w:lastColumn="1" w:noHBand="1" w:noVBand="1"/>
-        <w:tblCaption w:val="Table caption."/>
       </w:tblPr>
       <w:tblGrid>
         <w:gridCol w:w="782"/>
@@ -318,6 +317,135 @@
       <w:r>
         <w:t>Definition</w:t>
       </w:r>
+    </w:p>
+    <w:p>
+      <w:pPr>
+        <w:pStyle w:val="Definition"/>
+      </w:pPr>
+    </w:p>
+    <w:tbl>
+      <w:tblPr>
+        <w:tblStyle w:val="Table"/>
+        <w:tblW w:w="0" w:type="auto"/>
+        <w:tblBorders>
+          <w:top w:val="single" w:sz="4" w:space="0" w:color="0758E5"/>
+          <w:left w:val="single" w:sz="24" w:space="0" w:color="0758E5"/>
+          <w:bottom w:val="single" w:sz="4" w:space="0" w:color="0758E5"/>
+          <w:right w:val="single" w:sz="4" w:space="0" w:color="0758E5"/>
+        </w:tblBorders>
+        <w:tblCellMar>
+          <w:left w:w="144" w:type="dxa"/>
+          <w:right w:w="144" w:type="dxa"/>
+        </w:tblCellMar>
+        <w:tblLook w:val="0000" w:firstRow="0" w:lastRow="0" w:firstColumn="0" w:lastColumn="0" w:noHBand="0" w:noVBand="0"/>
+      </w:tblPr>
+      <w:tblGrid>
+        <w:gridCol w:w="9648"/>
+      </w:tblGrid>
+      <w:tr>
+        <w:trPr>
+          <w:cantSplit/>
+        </w:trPr>
+        <w:tc>
+          <w:tcPr>
+            <w:tcW w:w="0" w:type="auto"/>
+            <w:shd w:val="clear" w:color="auto" w:fill="DAE6FB"/>
+            <w:tcMar>
+              <w:top w:w="92" w:type="dxa"/>
+              <w:bottom w:w="92" w:type="dxa"/>
+            </w:tcMar>
+          </w:tcPr>
+          <w:p>
+            <w:pPr>
+              <w:pStyle w:val="BodyText"/>
+              <w:spacing w:before="0" w:after="0"/>
+              <w:textAlignment w:val="center"/>
+            </w:pPr>
+            <w:r>
+              <w:rPr>
+                <w:noProof/>
+              </w:rPr>
+              <w:lastRenderedPageBreak/>
+              <w:drawing>
+                <wp:inline distT="0" distB="0" distL="0" distR="0" wp14:anchorId="45433E2B" wp14:editId="3FB4CCD1">
+                  <wp:extent cx="152400" cy="152400"/>
+                  <wp:effectExtent l="0" t="0" r="0" b="0"/>
+                  <wp:docPr id="52" name="Picture"/>
+                  <wp:cNvGraphicFramePr/>
+                  <a:graphic xmlns:a="http://schemas.openxmlformats.org/drawingml/2006/main">
+                    <a:graphicData uri="http://schemas.openxmlformats.org/drawingml/2006/picture">
+                      <pic:pic xmlns:pic="http://schemas.openxmlformats.org/drawingml/2006/picture">
+                        <pic:nvPicPr>
+                          <pic:cNvPr id="53" name="Picture" descr="/Applications/quarto/share/formats/docx/note.png"/>
+                          <pic:cNvPicPr>
+                            <a:picLocks noChangeAspect="1" noChangeArrowheads="1"/>
+                          </pic:cNvPicPr>
+                        </pic:nvPicPr>
+                        <pic:blipFill>
+                          <a:blip r:embed="rId8"/>
+                          <a:stretch>
+                            <a:fillRect/>
+                          </a:stretch>
+                        </pic:blipFill>
+                        <pic:spPr bwMode="auto">
+                          <a:xfrm>
+                            <a:off x="0" y="0"/>
+                            <a:ext cx="152400" cy="152400"/>
+                          </a:xfrm>
+                          <a:prstGeom prst="rect">
+                            <a:avLst/>
+                          </a:prstGeom>
+                          <a:noFill/>
+                          <a:ln w="9525">
+                            <a:noFill/>
+                            <a:headEnd/>
+                            <a:tailEnd/>
+                          </a:ln>
+                        </pic:spPr>
+                      </pic:pic>
+                    </a:graphicData>
+                  </a:graphic>
+                </wp:inline>
+              </w:drawing>
+            </w:r>
+            <w:r>
+              <w:t xml:space="preserve">  Definition</w:t>
+            </w:r>
+          </w:p>
+        </w:tc>
+      </w:tr>
+      <w:tr>
+        <w:trPr>
+          <w:cantSplit/>
+        </w:trPr>
+        <w:tc>
+          <w:tcPr>
+            <w:tcW w:w="0" w:type="auto"/>
+            <w:tcMar>
+              <w:top w:w="108" w:type="dxa"/>
+              <w:bottom w:w="108" w:type="dxa"/>
+            </w:tcMar>
+          </w:tcPr>
+          <w:p>
+            <w:pPr>
+              <w:pStyle w:val="BodyText"/>
+              <w:spacing w:before="16" w:after="16"/>
+            </w:pPr>
+            <w:r>
+              <w:t>This is an example table</w:t>
+            </w:r>
+            <w:r>
+              <w:t xml:space="preserve"> that is derived from the callout notes that can be used in Quarto. I specifically included this example note so that I could click in the box, open Table Design, and then modify the Table style so that “Keep Next” is enabled i.e. so that boxes do not break across pages (unless they’re longer than one page—in which case, someone has put too much text into one of these callouts anyway.</w:t>
+            </w:r>
+          </w:p>
+          <w:p/>
+        </w:tc>
+      </w:tr>
+    </w:tbl>
+    <w:p>
+      <w:pPr>
+        <w:pStyle w:val="Definition"/>
+      </w:pPr>
     </w:p>
     <w:sectPr>
       <w:footnotePr>
@@ -1309,6 +1437,10 @@
     <w:semiHidden/>
     <w:unhideWhenUsed/>
     <w:qFormat/>
+    <w:rsid w:val="00145FCD"/>
+    <w:pPr>
+      <w:keepNext/>
+    </w:pPr>
     <w:tblPr>
       <w:tblInd w:w="0" w:type="dxa"/>
       <w:tblCellMar>

</xml_diff>

<commit_message>
Add a basic footer to the Word doc
</commit_message>
<xml_diff>
--- a/training/research-cycle-handbook/custom-reference-doc.docx
+++ b/training/research-cycle-handbook/custom-reference-doc.docx
@@ -46,6 +46,12 @@
       <w:pPr>
         <w:pStyle w:val="Heading1"/>
         <w:sectPr>
+          <w:headerReference w:type="even" r:id="rId7"/>
+          <w:headerReference w:type="default" r:id="rId8"/>
+          <w:footerReference w:type="even" r:id="rId9"/>
+          <w:footerReference w:type="default" r:id="rId10"/>
+          <w:headerReference w:type="first" r:id="rId11"/>
+          <w:footerReference w:type="first" r:id="rId12"/>
           <w:footnotePr>
             <w:numRestart w:val="eachSect"/>
           </w:footnotePr>
@@ -53,6 +59,7 @@
           <w:pgMar w:top="1440" w:right="1440" w:bottom="1440" w:left="1440" w:header="720" w:footer="720" w:gutter="0"/>
           <w:cols w:space="720"/>
           <w:vAlign w:val="center"/>
+          <w:titlePg/>
         </w:sectPr>
       </w:pPr>
       <w:bookmarkStart w:id="0" w:name="heading-1"/>
@@ -174,7 +181,7 @@
       <w:r>
         <w:t xml:space="preserve">. </w:t>
       </w:r>
-      <w:hyperlink r:id="rId7">
+      <w:hyperlink r:id="rId13">
         <w:r>
           <w:rPr>
             <w:rStyle w:val="Hyperlink"/>
@@ -382,7 +389,7 @@
                           </pic:cNvPicPr>
                         </pic:nvPicPr>
                         <pic:blipFill>
-                          <a:blip r:embed="rId8"/>
+                          <a:blip r:embed="rId14"/>
                           <a:stretch>
                             <a:fillRect/>
                           </a:stretch>
@@ -484,6 +491,159 @@
 </w:endnotes>
 </file>
 
+<file path=word/footer1.xml><?xml version="1.0" encoding="utf-8"?>
+<w:ftr xmlns:wpc="http://schemas.microsoft.com/office/word/2010/wordprocessingCanvas" xmlns:cx="http://schemas.microsoft.com/office/drawing/2014/chartex" xmlns:cx1="http://schemas.microsoft.com/office/drawing/2015/9/8/chartex" xmlns:cx2="http://schemas.microsoft.com/office/drawing/2015/10/21/chartex" xmlns:cx3="http://schemas.microsoft.com/office/drawing/2016/5/9/chartex" xmlns:cx4="http://schemas.microsoft.com/office/drawing/2016/5/10/chartex" xmlns:cx5="http://schemas.microsoft.com/office/drawing/2016/5/11/chartex" xmlns:cx6="http://schemas.microsoft.com/office/drawing/2016/5/12/chartex" xmlns:cx7="http://schemas.microsoft.com/office/drawing/2016/5/13/chartex" xmlns:cx8="http://schemas.microsoft.com/office/drawing/2016/5/14/chartex" xmlns:mc="http://schemas.openxmlformats.org/markup-compatibility/2006" xmlns:aink="http://schemas.microsoft.com/office/drawing/2016/ink" xmlns:am3d="http://schemas.microsoft.com/office/drawing/2017/model3d" xmlns:o="urn:schemas-microsoft-com:office:office" xmlns:oel="http://schemas.microsoft.com/office/2019/extlst" xmlns:r="http://schemas.openxmlformats.org/officeDocument/2006/relationships" xmlns:m="http://schemas.openxmlformats.org/officeDocument/2006/math" xmlns:v="urn:schemas-microsoft-com:vml" xmlns:wp14="http://schemas.microsoft.com/office/word/2010/wordprocessingDrawing" xmlns:wp="http://schemas.openxmlformats.org/drawingml/2006/wordprocessingDrawing" xmlns:w10="urn:schemas-microsoft-com:office:word" xmlns:w="http://schemas.openxmlformats.org/wordprocessingml/2006/main" xmlns:w14="http://schemas.microsoft.com/office/word/2010/wordml" xmlns:w15="http://schemas.microsoft.com/office/word/2012/wordml" xmlns:w16cex="http://schemas.microsoft.com/office/word/2018/wordml/cex" xmlns:w16cid="http://schemas.microsoft.com/office/word/2016/wordml/cid" xmlns:w16="http://schemas.microsoft.com/office/word/2018/wordml" xmlns:w16du="http://schemas.microsoft.com/office/word/2023/wordml/word16du" xmlns:w16sdtdh="http://schemas.microsoft.com/office/word/2020/wordml/sdtdatahash" xmlns:w16sdtfl="http://schemas.microsoft.com/office/word/2024/wordml/sdtformatlock" xmlns:w16se="http://schemas.microsoft.com/office/word/2015/wordml/symex" xmlns:wpg="http://schemas.microsoft.com/office/word/2010/wordprocessingGroup" xmlns:wpi="http://schemas.microsoft.com/office/word/2010/wordprocessingInk" xmlns:wne="http://schemas.microsoft.com/office/word/2006/wordml" xmlns:wps="http://schemas.microsoft.com/office/word/2010/wordprocessingShape" mc:Ignorable="w14 w15 w16se w16cid w16 w16cex w16sdtdh w16sdtfl w16du wp14">
+  <w:sdt>
+    <w:sdtPr>
+      <w:rPr>
+        <w:rStyle w:val="PageNumber"/>
+      </w:rPr>
+      <w:id w:val="-487332847"/>
+      <w:docPartObj>
+        <w:docPartGallery w:val="Page Numbers (Bottom of Page)"/>
+        <w:docPartUnique/>
+      </w:docPartObj>
+    </w:sdtPr>
+    <w:sdtContent>
+      <w:p>
+        <w:pPr>
+          <w:pStyle w:val="Footer"/>
+          <w:framePr w:wrap="none" w:vAnchor="text" w:hAnchor="margin" w:xAlign="right" w:y="1"/>
+          <w:rPr>
+            <w:rStyle w:val="PageNumber"/>
+          </w:rPr>
+        </w:pPr>
+        <w:r>
+          <w:rPr>
+            <w:rStyle w:val="PageNumber"/>
+          </w:rPr>
+          <w:fldChar w:fldCharType="begin"/>
+        </w:r>
+        <w:r>
+          <w:rPr>
+            <w:rStyle w:val="PageNumber"/>
+          </w:rPr>
+          <w:instrText xml:space="preserve"> PAGE </w:instrText>
+        </w:r>
+        <w:r>
+          <w:rPr>
+            <w:rStyle w:val="PageNumber"/>
+          </w:rPr>
+          <w:fldChar w:fldCharType="separate"/>
+        </w:r>
+        <w:r>
+          <w:rPr>
+            <w:rStyle w:val="PageNumber"/>
+          </w:rPr>
+          <w:fldChar w:fldCharType="end"/>
+        </w:r>
+      </w:p>
+    </w:sdtContent>
+  </w:sdt>
+  <w:p>
+    <w:pPr>
+      <w:pStyle w:val="Footer"/>
+      <w:ind w:right="360"/>
+    </w:pPr>
+  </w:p>
+</w:ftr>
+</file>
+
+<file path=word/footer2.xml><?xml version="1.0" encoding="utf-8"?>
+<w:ftr xmlns:wpc="http://schemas.microsoft.com/office/word/2010/wordprocessingCanvas" xmlns:cx="http://schemas.microsoft.com/office/drawing/2014/chartex" xmlns:cx1="http://schemas.microsoft.com/office/drawing/2015/9/8/chartex" xmlns:cx2="http://schemas.microsoft.com/office/drawing/2015/10/21/chartex" xmlns:cx3="http://schemas.microsoft.com/office/drawing/2016/5/9/chartex" xmlns:cx4="http://schemas.microsoft.com/office/drawing/2016/5/10/chartex" xmlns:cx5="http://schemas.microsoft.com/office/drawing/2016/5/11/chartex" xmlns:cx6="http://schemas.microsoft.com/office/drawing/2016/5/12/chartex" xmlns:cx7="http://schemas.microsoft.com/office/drawing/2016/5/13/chartex" xmlns:cx8="http://schemas.microsoft.com/office/drawing/2016/5/14/chartex" xmlns:mc="http://schemas.openxmlformats.org/markup-compatibility/2006" xmlns:aink="http://schemas.microsoft.com/office/drawing/2016/ink" xmlns:am3d="http://schemas.microsoft.com/office/drawing/2017/model3d" xmlns:o="urn:schemas-microsoft-com:office:office" xmlns:oel="http://schemas.microsoft.com/office/2019/extlst" xmlns:r="http://schemas.openxmlformats.org/officeDocument/2006/relationships" xmlns:m="http://schemas.openxmlformats.org/officeDocument/2006/math" xmlns:v="urn:schemas-microsoft-com:vml" xmlns:wp14="http://schemas.microsoft.com/office/word/2010/wordprocessingDrawing" xmlns:wp="http://schemas.openxmlformats.org/drawingml/2006/wordprocessingDrawing" xmlns:w10="urn:schemas-microsoft-com:office:word" xmlns:w="http://schemas.openxmlformats.org/wordprocessingml/2006/main" xmlns:w14="http://schemas.microsoft.com/office/word/2010/wordml" xmlns:w15="http://schemas.microsoft.com/office/word/2012/wordml" xmlns:w16cex="http://schemas.microsoft.com/office/word/2018/wordml/cex" xmlns:w16cid="http://schemas.microsoft.com/office/word/2016/wordml/cid" xmlns:w16="http://schemas.microsoft.com/office/word/2018/wordml" xmlns:w16du="http://schemas.microsoft.com/office/word/2023/wordml/word16du" xmlns:w16sdtdh="http://schemas.microsoft.com/office/word/2020/wordml/sdtdatahash" xmlns:w16sdtfl="http://schemas.microsoft.com/office/word/2024/wordml/sdtformatlock" xmlns:w16se="http://schemas.microsoft.com/office/word/2015/wordml/symex" xmlns:wpg="http://schemas.microsoft.com/office/word/2010/wordprocessingGroup" xmlns:wpi="http://schemas.microsoft.com/office/word/2010/wordprocessingInk" xmlns:wne="http://schemas.microsoft.com/office/word/2006/wordml" xmlns:wps="http://schemas.microsoft.com/office/word/2010/wordprocessingShape" mc:Ignorable="w14 w15 w16se w16cid w16 w16cex w16sdtdh w16sdtfl w16du wp14">
+  <w:sdt>
+    <w:sdtPr>
+      <w:rPr>
+        <w:rStyle w:val="PageNumber"/>
+      </w:rPr>
+      <w:id w:val="-1815561089"/>
+      <w:docPartObj>
+        <w:docPartGallery w:val="Page Numbers (Bottom of Page)"/>
+        <w:docPartUnique/>
+      </w:docPartObj>
+    </w:sdtPr>
+    <w:sdtContent>
+      <w:p>
+        <w:pPr>
+          <w:pStyle w:val="Footer"/>
+          <w:framePr w:wrap="none" w:vAnchor="text" w:hAnchor="margin" w:xAlign="right" w:y="1"/>
+          <w:rPr>
+            <w:rStyle w:val="PageNumber"/>
+          </w:rPr>
+        </w:pPr>
+        <w:r>
+          <w:rPr>
+            <w:rStyle w:val="PageNumber"/>
+          </w:rPr>
+          <w:fldChar w:fldCharType="begin"/>
+        </w:r>
+        <w:r>
+          <w:rPr>
+            <w:rStyle w:val="PageNumber"/>
+          </w:rPr>
+          <w:instrText xml:space="preserve"> PAGE </w:instrText>
+        </w:r>
+        <w:r>
+          <w:rPr>
+            <w:rStyle w:val="PageNumber"/>
+          </w:rPr>
+          <w:fldChar w:fldCharType="separate"/>
+        </w:r>
+        <w:r>
+          <w:rPr>
+            <w:rStyle w:val="PageNumber"/>
+            <w:noProof/>
+          </w:rPr>
+          <w:t>1</w:t>
+        </w:r>
+        <w:r>
+          <w:rPr>
+            <w:rStyle w:val="PageNumber"/>
+          </w:rPr>
+          <w:fldChar w:fldCharType="end"/>
+        </w:r>
+      </w:p>
+    </w:sdtContent>
+  </w:sdt>
+  <w:p>
+    <w:pPr>
+      <w:pStyle w:val="Footer"/>
+      <w:ind w:right="360"/>
+    </w:pPr>
+    <w:r>
+      <w:t xml:space="preserve">LMU Open Science </w:t>
+    </w:r>
+    <w:r>
+      <w:t>Center</w:t>
+    </w:r>
+    <w:r>
+      <w:ptab w:relativeTo="margin" w:alignment="center" w:leader="none"/>
+    </w:r>
+    <w:hyperlink r:id="rId1" w:history="1">
+      <w:r>
+        <w:rPr>
+          <w:rStyle w:val="Hyperlink"/>
+        </w:rPr>
+        <w:t>How to cite</w:t>
+      </w:r>
+    </w:hyperlink>
+    <w:r>
+      <w:ptab w:relativeTo="margin" w:alignment="right" w:leader="none"/>
+    </w:r>
+  </w:p>
+</w:ftr>
+</file>
+
+<file path=word/footer3.xml><?xml version="1.0" encoding="utf-8"?>
+<w:ftr xmlns:wpc="http://schemas.microsoft.com/office/word/2010/wordprocessingCanvas" xmlns:cx="http://schemas.microsoft.com/office/drawing/2014/chartex" xmlns:cx1="http://schemas.microsoft.com/office/drawing/2015/9/8/chartex" xmlns:cx2="http://schemas.microsoft.com/office/drawing/2015/10/21/chartex" xmlns:cx3="http://schemas.microsoft.com/office/drawing/2016/5/9/chartex" xmlns:cx4="http://schemas.microsoft.com/office/drawing/2016/5/10/chartex" xmlns:cx5="http://schemas.microsoft.com/office/drawing/2016/5/11/chartex" xmlns:cx6="http://schemas.microsoft.com/office/drawing/2016/5/12/chartex" xmlns:cx7="http://schemas.microsoft.com/office/drawing/2016/5/13/chartex" xmlns:cx8="http://schemas.microsoft.com/office/drawing/2016/5/14/chartex" xmlns:mc="http://schemas.openxmlformats.org/markup-compatibility/2006" xmlns:aink="http://schemas.microsoft.com/office/drawing/2016/ink" xmlns:am3d="http://schemas.microsoft.com/office/drawing/2017/model3d" xmlns:o="urn:schemas-microsoft-com:office:office" xmlns:oel="http://schemas.microsoft.com/office/2019/extlst" xmlns:r="http://schemas.openxmlformats.org/officeDocument/2006/relationships" xmlns:m="http://schemas.openxmlformats.org/officeDocument/2006/math" xmlns:v="urn:schemas-microsoft-com:vml" xmlns:wp14="http://schemas.microsoft.com/office/word/2010/wordprocessingDrawing" xmlns:wp="http://schemas.openxmlformats.org/drawingml/2006/wordprocessingDrawing" xmlns:w10="urn:schemas-microsoft-com:office:word" xmlns:w="http://schemas.openxmlformats.org/wordprocessingml/2006/main" xmlns:w14="http://schemas.microsoft.com/office/word/2010/wordml" xmlns:w15="http://schemas.microsoft.com/office/word/2012/wordml" xmlns:w16cex="http://schemas.microsoft.com/office/word/2018/wordml/cex" xmlns:w16cid="http://schemas.microsoft.com/office/word/2016/wordml/cid" xmlns:w16="http://schemas.microsoft.com/office/word/2018/wordml" xmlns:w16du="http://schemas.microsoft.com/office/word/2023/wordml/word16du" xmlns:w16sdtdh="http://schemas.microsoft.com/office/word/2020/wordml/sdtdatahash" xmlns:w16sdtfl="http://schemas.microsoft.com/office/word/2024/wordml/sdtformatlock" xmlns:w16se="http://schemas.microsoft.com/office/word/2015/wordml/symex" xmlns:wpg="http://schemas.microsoft.com/office/word/2010/wordprocessingGroup" xmlns:wpi="http://schemas.microsoft.com/office/word/2010/wordprocessingInk" xmlns:wne="http://schemas.microsoft.com/office/word/2006/wordml" xmlns:wps="http://schemas.microsoft.com/office/word/2010/wordprocessingShape" mc:Ignorable="w14 w15 w16se w16cid w16 w16cex w16sdtdh w16sdtfl w16du wp14">
+  <w:p>
+    <w:pPr>
+      <w:pStyle w:val="Footer"/>
+    </w:pPr>
+  </w:p>
+</w:ftr>
+</file>
+
 <file path=word/footnotes.xml><?xml version="1.0" encoding="utf-8"?>
 <w:footnotes xmlns:wpc="http://schemas.microsoft.com/office/word/2010/wordprocessingCanvas" xmlns:cx="http://schemas.microsoft.com/office/drawing/2014/chartex" xmlns:cx1="http://schemas.microsoft.com/office/drawing/2015/9/8/chartex" xmlns:cx2="http://schemas.microsoft.com/office/drawing/2015/10/21/chartex" xmlns:cx3="http://schemas.microsoft.com/office/drawing/2016/5/9/chartex" xmlns:cx4="http://schemas.microsoft.com/office/drawing/2016/5/10/chartex" xmlns:cx5="http://schemas.microsoft.com/office/drawing/2016/5/11/chartex" xmlns:cx6="http://schemas.microsoft.com/office/drawing/2016/5/12/chartex" xmlns:cx7="http://schemas.microsoft.com/office/drawing/2016/5/13/chartex" xmlns:cx8="http://schemas.microsoft.com/office/drawing/2016/5/14/chartex" xmlns:mc="http://schemas.openxmlformats.org/markup-compatibility/2006" xmlns:aink="http://schemas.microsoft.com/office/drawing/2016/ink" xmlns:am3d="http://schemas.microsoft.com/office/drawing/2017/model3d" xmlns:o="urn:schemas-microsoft-com:office:office" xmlns:oel="http://schemas.microsoft.com/office/2019/extlst" xmlns:r="http://schemas.openxmlformats.org/officeDocument/2006/relationships" xmlns:m="http://schemas.openxmlformats.org/officeDocument/2006/math" xmlns:v="urn:schemas-microsoft-com:vml" xmlns:wp14="http://schemas.microsoft.com/office/word/2010/wordprocessingDrawing" xmlns:wp="http://schemas.openxmlformats.org/drawingml/2006/wordprocessingDrawing" xmlns:w10="urn:schemas-microsoft-com:office:word" xmlns:w="http://schemas.openxmlformats.org/wordprocessingml/2006/main" xmlns:w14="http://schemas.microsoft.com/office/word/2010/wordml" xmlns:w15="http://schemas.microsoft.com/office/word/2012/wordml" xmlns:w16cex="http://schemas.microsoft.com/office/word/2018/wordml/cex" xmlns:w16cid="http://schemas.microsoft.com/office/word/2016/wordml/cid" xmlns:w16="http://schemas.microsoft.com/office/word/2018/wordml" xmlns:w16du="http://schemas.microsoft.com/office/word/2023/wordml/word16du" xmlns:w16sdtdh="http://schemas.microsoft.com/office/word/2020/wordml/sdtdatahash" xmlns:w16sdtfl="http://schemas.microsoft.com/office/word/2024/wordml/sdtformatlock" xmlns:w16se="http://schemas.microsoft.com/office/word/2015/wordml/symex" xmlns:wpg="http://schemas.microsoft.com/office/word/2010/wordprocessingGroup" xmlns:wpi="http://schemas.microsoft.com/office/word/2010/wordprocessingInk" xmlns:wne="http://schemas.microsoft.com/office/word/2006/wordml" xmlns:wps="http://schemas.microsoft.com/office/word/2010/wordprocessingShape" mc:Ignorable="w14 w15 w16se w16cid w16 w16cex w16sdtdh w16sdtfl w16du wp14">
   <w:footnote w:type="separator" w:id="-1">
@@ -525,6 +685,36 @@
     </w:p>
   </w:footnote>
 </w:footnotes>
+</file>
+
+<file path=word/header1.xml><?xml version="1.0" encoding="utf-8"?>
+<w:hdr xmlns:wpc="http://schemas.microsoft.com/office/word/2010/wordprocessingCanvas" xmlns:cx="http://schemas.microsoft.com/office/drawing/2014/chartex" xmlns:cx1="http://schemas.microsoft.com/office/drawing/2015/9/8/chartex" xmlns:cx2="http://schemas.microsoft.com/office/drawing/2015/10/21/chartex" xmlns:cx3="http://schemas.microsoft.com/office/drawing/2016/5/9/chartex" xmlns:cx4="http://schemas.microsoft.com/office/drawing/2016/5/10/chartex" xmlns:cx5="http://schemas.microsoft.com/office/drawing/2016/5/11/chartex" xmlns:cx6="http://schemas.microsoft.com/office/drawing/2016/5/12/chartex" xmlns:cx7="http://schemas.microsoft.com/office/drawing/2016/5/13/chartex" xmlns:cx8="http://schemas.microsoft.com/office/drawing/2016/5/14/chartex" xmlns:mc="http://schemas.openxmlformats.org/markup-compatibility/2006" xmlns:aink="http://schemas.microsoft.com/office/drawing/2016/ink" xmlns:am3d="http://schemas.microsoft.com/office/drawing/2017/model3d" xmlns:o="urn:schemas-microsoft-com:office:office" xmlns:oel="http://schemas.microsoft.com/office/2019/extlst" xmlns:r="http://schemas.openxmlformats.org/officeDocument/2006/relationships" xmlns:m="http://schemas.openxmlformats.org/officeDocument/2006/math" xmlns:v="urn:schemas-microsoft-com:vml" xmlns:wp14="http://schemas.microsoft.com/office/word/2010/wordprocessingDrawing" xmlns:wp="http://schemas.openxmlformats.org/drawingml/2006/wordprocessingDrawing" xmlns:w10="urn:schemas-microsoft-com:office:word" xmlns:w="http://schemas.openxmlformats.org/wordprocessingml/2006/main" xmlns:w14="http://schemas.microsoft.com/office/word/2010/wordml" xmlns:w15="http://schemas.microsoft.com/office/word/2012/wordml" xmlns:w16cex="http://schemas.microsoft.com/office/word/2018/wordml/cex" xmlns:w16cid="http://schemas.microsoft.com/office/word/2016/wordml/cid" xmlns:w16="http://schemas.microsoft.com/office/word/2018/wordml" xmlns:w16du="http://schemas.microsoft.com/office/word/2023/wordml/word16du" xmlns:w16sdtdh="http://schemas.microsoft.com/office/word/2020/wordml/sdtdatahash" xmlns:w16sdtfl="http://schemas.microsoft.com/office/word/2024/wordml/sdtformatlock" xmlns:w16se="http://schemas.microsoft.com/office/word/2015/wordml/symex" xmlns:wpg="http://schemas.microsoft.com/office/word/2010/wordprocessingGroup" xmlns:wpi="http://schemas.microsoft.com/office/word/2010/wordprocessingInk" xmlns:wne="http://schemas.microsoft.com/office/word/2006/wordml" xmlns:wps="http://schemas.microsoft.com/office/word/2010/wordprocessingShape" mc:Ignorable="w14 w15 w16se w16cid w16 w16cex w16sdtdh w16sdtfl w16du wp14">
+  <w:p>
+    <w:pPr>
+      <w:pStyle w:val="Header"/>
+    </w:pPr>
+  </w:p>
+</w:hdr>
+</file>
+
+<file path=word/header2.xml><?xml version="1.0" encoding="utf-8"?>
+<w:hdr xmlns:wpc="http://schemas.microsoft.com/office/word/2010/wordprocessingCanvas" xmlns:cx="http://schemas.microsoft.com/office/drawing/2014/chartex" xmlns:cx1="http://schemas.microsoft.com/office/drawing/2015/9/8/chartex" xmlns:cx2="http://schemas.microsoft.com/office/drawing/2015/10/21/chartex" xmlns:cx3="http://schemas.microsoft.com/office/drawing/2016/5/9/chartex" xmlns:cx4="http://schemas.microsoft.com/office/drawing/2016/5/10/chartex" xmlns:cx5="http://schemas.microsoft.com/office/drawing/2016/5/11/chartex" xmlns:cx6="http://schemas.microsoft.com/office/drawing/2016/5/12/chartex" xmlns:cx7="http://schemas.microsoft.com/office/drawing/2016/5/13/chartex" xmlns:cx8="http://schemas.microsoft.com/office/drawing/2016/5/14/chartex" xmlns:mc="http://schemas.openxmlformats.org/markup-compatibility/2006" xmlns:aink="http://schemas.microsoft.com/office/drawing/2016/ink" xmlns:am3d="http://schemas.microsoft.com/office/drawing/2017/model3d" xmlns:o="urn:schemas-microsoft-com:office:office" xmlns:oel="http://schemas.microsoft.com/office/2019/extlst" xmlns:r="http://schemas.openxmlformats.org/officeDocument/2006/relationships" xmlns:m="http://schemas.openxmlformats.org/officeDocument/2006/math" xmlns:v="urn:schemas-microsoft-com:vml" xmlns:wp14="http://schemas.microsoft.com/office/word/2010/wordprocessingDrawing" xmlns:wp="http://schemas.openxmlformats.org/drawingml/2006/wordprocessingDrawing" xmlns:w10="urn:schemas-microsoft-com:office:word" xmlns:w="http://schemas.openxmlformats.org/wordprocessingml/2006/main" xmlns:w14="http://schemas.microsoft.com/office/word/2010/wordml" xmlns:w15="http://schemas.microsoft.com/office/word/2012/wordml" xmlns:w16cex="http://schemas.microsoft.com/office/word/2018/wordml/cex" xmlns:w16cid="http://schemas.microsoft.com/office/word/2016/wordml/cid" xmlns:w16="http://schemas.microsoft.com/office/word/2018/wordml" xmlns:w16du="http://schemas.microsoft.com/office/word/2023/wordml/word16du" xmlns:w16sdtdh="http://schemas.microsoft.com/office/word/2020/wordml/sdtdatahash" xmlns:w16sdtfl="http://schemas.microsoft.com/office/word/2024/wordml/sdtformatlock" xmlns:w16se="http://schemas.microsoft.com/office/word/2015/wordml/symex" xmlns:wpg="http://schemas.microsoft.com/office/word/2010/wordprocessingGroup" xmlns:wpi="http://schemas.microsoft.com/office/word/2010/wordprocessingInk" xmlns:wne="http://schemas.microsoft.com/office/word/2006/wordml" xmlns:wps="http://schemas.microsoft.com/office/word/2010/wordprocessingShape" mc:Ignorable="w14 w15 w16se w16cid w16 w16cex w16sdtdh w16sdtfl w16du wp14">
+  <w:p>
+    <w:pPr>
+      <w:pStyle w:val="Header"/>
+    </w:pPr>
+  </w:p>
+</w:hdr>
+</file>
+
+<file path=word/header3.xml><?xml version="1.0" encoding="utf-8"?>
+<w:hdr xmlns:wpc="http://schemas.microsoft.com/office/word/2010/wordprocessingCanvas" xmlns:cx="http://schemas.microsoft.com/office/drawing/2014/chartex" xmlns:cx1="http://schemas.microsoft.com/office/drawing/2015/9/8/chartex" xmlns:cx2="http://schemas.microsoft.com/office/drawing/2015/10/21/chartex" xmlns:cx3="http://schemas.microsoft.com/office/drawing/2016/5/9/chartex" xmlns:cx4="http://schemas.microsoft.com/office/drawing/2016/5/10/chartex" xmlns:cx5="http://schemas.microsoft.com/office/drawing/2016/5/11/chartex" xmlns:cx6="http://schemas.microsoft.com/office/drawing/2016/5/12/chartex" xmlns:cx7="http://schemas.microsoft.com/office/drawing/2016/5/13/chartex" xmlns:cx8="http://schemas.microsoft.com/office/drawing/2016/5/14/chartex" xmlns:mc="http://schemas.openxmlformats.org/markup-compatibility/2006" xmlns:aink="http://schemas.microsoft.com/office/drawing/2016/ink" xmlns:am3d="http://schemas.microsoft.com/office/drawing/2017/model3d" xmlns:o="urn:schemas-microsoft-com:office:office" xmlns:oel="http://schemas.microsoft.com/office/2019/extlst" xmlns:r="http://schemas.openxmlformats.org/officeDocument/2006/relationships" xmlns:m="http://schemas.openxmlformats.org/officeDocument/2006/math" xmlns:v="urn:schemas-microsoft-com:vml" xmlns:wp14="http://schemas.microsoft.com/office/word/2010/wordprocessingDrawing" xmlns:wp="http://schemas.openxmlformats.org/drawingml/2006/wordprocessingDrawing" xmlns:w10="urn:schemas-microsoft-com:office:word" xmlns:w="http://schemas.openxmlformats.org/wordprocessingml/2006/main" xmlns:w14="http://schemas.microsoft.com/office/word/2010/wordml" xmlns:w15="http://schemas.microsoft.com/office/word/2012/wordml" xmlns:w16cex="http://schemas.microsoft.com/office/word/2018/wordml/cex" xmlns:w16cid="http://schemas.microsoft.com/office/word/2016/wordml/cid" xmlns:w16="http://schemas.microsoft.com/office/word/2018/wordml" xmlns:w16du="http://schemas.microsoft.com/office/word/2023/wordml/word16du" xmlns:w16sdtdh="http://schemas.microsoft.com/office/word/2020/wordml/sdtdatahash" xmlns:w16sdtfl="http://schemas.microsoft.com/office/word/2024/wordml/sdtformatlock" xmlns:w16se="http://schemas.microsoft.com/office/word/2015/wordml/symex" xmlns:wpg="http://schemas.microsoft.com/office/word/2010/wordprocessingGroup" xmlns:wpi="http://schemas.microsoft.com/office/word/2010/wordprocessingInk" xmlns:wne="http://schemas.microsoft.com/office/word/2006/wordml" xmlns:wps="http://schemas.microsoft.com/office/word/2010/wordprocessingShape" mc:Ignorable="w14 w15 w16se w16cid w16 w16cex w16sdtdh w16sdtfl w16du wp14">
+  <w:p>
+    <w:pPr>
+      <w:pStyle w:val="Header"/>
+    </w:pPr>
+  </w:p>
+</w:hdr>
 </file>
 
 <file path=word/numbering.xml><?xml version="1.0" encoding="utf-8"?>
@@ -1552,6 +1742,61 @@
       <w:spacing w:before="240" w:line="259" w:lineRule="auto"/>
       <w:outlineLvl w:val="9"/>
     </w:pPr>
+  </w:style>
+  <w:style w:type="paragraph" w:styleId="Header">
+    <w:name w:val="header"/>
+    <w:basedOn w:val="Normal"/>
+    <w:link w:val="HeaderChar"/>
+    <w:rsid w:val="00D76530"/>
+    <w:pPr>
+      <w:tabs>
+        <w:tab w:val="center" w:pos="4680"/>
+        <w:tab w:val="right" w:pos="9360"/>
+      </w:tabs>
+      <w:spacing w:after="0"/>
+    </w:pPr>
+  </w:style>
+  <w:style w:type="character" w:customStyle="1" w:styleId="HeaderChar">
+    <w:name w:val="Header Char"/>
+    <w:basedOn w:val="DefaultParagraphFont"/>
+    <w:link w:val="Header"/>
+    <w:rsid w:val="00D76530"/>
+  </w:style>
+  <w:style w:type="paragraph" w:styleId="Footer">
+    <w:name w:val="footer"/>
+    <w:basedOn w:val="Normal"/>
+    <w:link w:val="FooterChar"/>
+    <w:rsid w:val="00D76530"/>
+    <w:pPr>
+      <w:tabs>
+        <w:tab w:val="center" w:pos="4680"/>
+        <w:tab w:val="right" w:pos="9360"/>
+      </w:tabs>
+      <w:spacing w:after="0"/>
+    </w:pPr>
+  </w:style>
+  <w:style w:type="character" w:customStyle="1" w:styleId="FooterChar">
+    <w:name w:val="Footer Char"/>
+    <w:basedOn w:val="DefaultParagraphFont"/>
+    <w:link w:val="Footer"/>
+    <w:rsid w:val="00D76530"/>
+  </w:style>
+  <w:style w:type="character" w:styleId="PageNumber">
+    <w:name w:val="page number"/>
+    <w:basedOn w:val="DefaultParagraphFont"/>
+    <w:rsid w:val="00D76530"/>
+  </w:style>
+  <w:style w:type="character" w:styleId="UnresolvedMention">
+    <w:name w:val="Unresolved Mention"/>
+    <w:basedOn w:val="DefaultParagraphFont"/>
+    <w:uiPriority w:val="99"/>
+    <w:semiHidden/>
+    <w:unhideWhenUsed/>
+    <w:rsid w:val="00D76530"/>
+    <w:rPr>
+      <w:color w:val="605E5C"/>
+      <w:shd w:val="clear" w:color="auto" w:fill="E1DFDD"/>
+    </w:rPr>
   </w:style>
 </w:styles>
 </file>

</xml_diff>